<commit_message>
I DID THE INVENTORY THING!!!!!!!!!!
</commit_message>
<xml_diff>
--- a/GEP 25-26 Worksheet 1.docx
+++ b/GEP 25-26 Worksheet 1.docx
@@ -89,8 +89,13 @@
       <w:r>
         <w:t xml:space="preserve">how to work with Unity’s </w:t>
       </w:r>
-      <w:r>
-        <w:t>MonoBehaviour architecture</w:t>
+      <w:proofErr w:type="spellStart"/>
+      <w:r>
+        <w:t>MonoBehaviour</w:t>
+      </w:r>
+      <w:proofErr w:type="spellEnd"/>
+      <w:r>
+        <w:t xml:space="preserve"> architecture</w:t>
       </w:r>
       <w:r>
         <w:t>, how to script with C# in Unity, and how to work with its game object model.</w:t>
@@ -139,7 +144,15 @@
         <w:t>r</w:t>
       </w:r>
       <w:r>
-        <w:t xml:space="preserve">, and working with GitHub / GitKraken from </w:t>
+        <w:t xml:space="preserve">, and working with GitHub / </w:t>
+      </w:r>
+      <w:proofErr w:type="spellStart"/>
+      <w:r>
+        <w:t>GitKraken</w:t>
+      </w:r>
+      <w:proofErr w:type="spellEnd"/>
+      <w:r>
+        <w:t xml:space="preserve"> from </w:t>
       </w:r>
       <w:r>
         <w:t>both</w:t>
@@ -203,10 +216,18 @@
         <w:t xml:space="preserve">these in a way </w:t>
       </w:r>
       <w:r>
-        <w:t>that is strongly object-oriented</w:t>
-      </w:r>
-      <w:r>
-        <w:t>, and add features to these that can be built upon in later worksheets.</w:t>
+        <w:t xml:space="preserve">that is strongly </w:t>
+      </w:r>
+      <w:proofErr w:type="gramStart"/>
+      <w:r>
+        <w:t>object-oriented</w:t>
+      </w:r>
+      <w:r>
+        <w:t>, and</w:t>
+      </w:r>
+      <w:proofErr w:type="gramEnd"/>
+      <w:r>
+        <w:t xml:space="preserve"> add features to these that can be built upon in later worksheets.</w:t>
       </w:r>
       <w:r>
         <w:t xml:space="preserve"> </w:t>
@@ -349,31 +370,7 @@
         <w:sdtPr>
           <w:id w:val="443195179"/>
           <w14:checkbox>
-            <w14:checked w14:val="0"/>
-            <w14:checkedState w14:val="2612" w14:font="MS Gothic"/>
-            <w14:uncheckedState w14:val="2610" w14:font="MS Gothic"/>
-          </w14:checkbox>
-        </w:sdtPr>
-        <w:sdtContent>
-          <w:r>
-            <w:rPr>
-              <w:rFonts w:ascii="MS Gothic" w:eastAsia="MS Gothic" w:hAnsi="MS Gothic" w:cs="MS Gothic" w:hint="eastAsia"/>
-            </w:rPr>
-            <w:t>☐</w:t>
-          </w:r>
-        </w:sdtContent>
-      </w:sdt>
-      <w:r>
-        <w:t>Project Cloning</w:t>
-      </w:r>
-      <w:r>
-        <w:br/>
-      </w:r>
-      <w:sdt>
-        <w:sdtPr>
-          <w:id w:val="1740439158"/>
-          <w14:checkbox>
-            <w14:checked w14:val="0"/>
+            <w14:checked w14:val="1"/>
             <w14:checkedState w14:val="2612" w14:font="MS Gothic"/>
             <w14:uncheckedState w14:val="2610" w14:font="MS Gothic"/>
           </w14:checkbox>
@@ -383,21 +380,21 @@
             <w:rPr>
               <w:rFonts w:ascii="MS Gothic" w:eastAsia="MS Gothic" w:hAnsi="MS Gothic" w:hint="eastAsia"/>
             </w:rPr>
-            <w:t>☐</w:t>
+            <w:t>☒</w:t>
           </w:r>
         </w:sdtContent>
       </w:sdt>
       <w:r>
-        <w:t>Game Manager &amp; State Machine</w:t>
+        <w:t>Project Cloning</w:t>
       </w:r>
       <w:r>
         <w:br/>
       </w:r>
       <w:sdt>
         <w:sdtPr>
-          <w:id w:val="1506394597"/>
+          <w:id w:val="1740439158"/>
           <w14:checkbox>
-            <w14:checked w14:val="0"/>
+            <w14:checked w14:val="1"/>
             <w14:checkedState w14:val="2612" w14:font="MS Gothic"/>
             <w14:uncheckedState w14:val="2610" w14:font="MS Gothic"/>
           </w14:checkbox>
@@ -407,7 +404,31 @@
             <w:rPr>
               <w:rFonts w:ascii="MS Gothic" w:eastAsia="MS Gothic" w:hAnsi="MS Gothic" w:hint="eastAsia"/>
             </w:rPr>
-            <w:t>☐</w:t>
+            <w:t>☒</w:t>
+          </w:r>
+        </w:sdtContent>
+      </w:sdt>
+      <w:r>
+        <w:t>Game Manager &amp; State Machine</w:t>
+      </w:r>
+      <w:r>
+        <w:br/>
+      </w:r>
+      <w:sdt>
+        <w:sdtPr>
+          <w:id w:val="1506394597"/>
+          <w14:checkbox>
+            <w14:checked w14:val="1"/>
+            <w14:checkedState w14:val="2612" w14:font="MS Gothic"/>
+            <w14:uncheckedState w14:val="2610" w14:font="MS Gothic"/>
+          </w14:checkbox>
+        </w:sdtPr>
+        <w:sdtContent>
+          <w:r>
+            <w:rPr>
+              <w:rFonts w:ascii="MS Gothic" w:eastAsia="MS Gothic" w:hAnsi="MS Gothic" w:hint="eastAsia"/>
+            </w:rPr>
+            <w:t>☒</w:t>
           </w:r>
         </w:sdtContent>
       </w:sdt>
@@ -832,7 +853,15 @@
         <w:t>rd</w:t>
       </w:r>
       <w:r>
-        <w:t xml:space="preserve"> Person Controller, alongside some changes to the project settings in order to help</w:t>
+        <w:t xml:space="preserve"> Person Controller, alongside some changes to the project settings </w:t>
+      </w:r>
+      <w:proofErr w:type="gramStart"/>
+      <w:r>
+        <w:t>in order to</w:t>
+      </w:r>
+      <w:proofErr w:type="gramEnd"/>
+      <w:r>
+        <w:t xml:space="preserve"> help</w:t>
       </w:r>
       <w:r>
         <w:t xml:space="preserve"> the teaching of this module and make following worksheets easier. </w:t>
@@ -871,6 +900,7 @@
     <w:p>
       <w:pPr>
         <w:rPr>
+          <w:rFonts w:hint="eastAsia"/>
           <w:noProof/>
         </w:rPr>
       </w:pPr>
@@ -881,7 +911,15 @@
         <w:t>clone the repository onto your local working space</w:t>
       </w:r>
       <w:r>
-        <w:t xml:space="preserve"> through GitKraken / GitHub Desktop</w:t>
+        <w:t xml:space="preserve"> through </w:t>
+      </w:r>
+      <w:proofErr w:type="spellStart"/>
+      <w:r>
+        <w:t>GitKraken</w:t>
+      </w:r>
+      <w:proofErr w:type="spellEnd"/>
+      <w:r>
+        <w:t xml:space="preserve"> / GitHub Desktop</w:t>
       </w:r>
       <w:r>
         <w:t>. If you are using the Lab PCs, we recommend that you do so on the D: drive – this is the local sto</w:t>
@@ -990,7 +1028,15 @@
         <w:t xml:space="preserve"> projects, and click on it in the list to open it. </w:t>
       </w:r>
       <w:r>
-        <w:t xml:space="preserve">Once the project has loaded, open up the GEP Sample Scene found inside the GEP Core folder. </w:t>
+        <w:t xml:space="preserve">Once the project has loaded, </w:t>
+      </w:r>
+      <w:proofErr w:type="gramStart"/>
+      <w:r>
+        <w:t>open up</w:t>
+      </w:r>
+      <w:proofErr w:type="gramEnd"/>
+      <w:r>
+        <w:t xml:space="preserve"> the GEP Sample Scene found inside the GEP Core folder. </w:t>
       </w:r>
       <w:r>
         <w:t>Yo</w:t>
@@ -1008,6 +1054,9 @@
         </w:rPr>
       </w:pPr>
       <w:r>
+        <w:rPr>
+          <w:noProof/>
+        </w:rPr>
         <w:drawing>
           <wp:inline distT="0" distB="0" distL="0" distR="0" wp14:anchorId="3378B1B7" wp14:editId="1F45A8FE">
             <wp:extent cx="4320000" cy="2424000"/>
@@ -1050,7 +1099,6 @@
         <w:pStyle w:val="Heading2"/>
       </w:pPr>
       <w:r>
-        <w:lastRenderedPageBreak/>
         <w:t xml:space="preserve">Adding the </w:t>
       </w:r>
       <w:r>
@@ -1067,6 +1115,7 @@
         </w:rPr>
       </w:pPr>
       <w:r>
+        <w:lastRenderedPageBreak/>
         <w:t xml:space="preserve">Now that you have the project </w:t>
       </w:r>
       <w:r>
@@ -1096,9 +1145,11 @@
       <w:r>
         <w:t xml:space="preserve">reate a </w:t>
       </w:r>
+      <w:proofErr w:type="spellStart"/>
       <w:r>
         <w:t>MonoBehaviour</w:t>
       </w:r>
+      <w:proofErr w:type="spellEnd"/>
       <w:r>
         <w:t xml:space="preserve"> script for </w:t>
       </w:r>
@@ -1151,9 +1202,11 @@
       <w:r>
         <w:t xml:space="preserve">using the Enter / Return key on the </w:t>
       </w:r>
+      <w:proofErr w:type="gramStart"/>
       <w:r>
         <w:t>keyboard, and</w:t>
       </w:r>
+      <w:proofErr w:type="gramEnd"/>
       <w:r>
         <w:t xml:space="preserve"> implement </w:t>
       </w:r>
@@ -1222,13 +1275,29 @@
         <w:t>.</w:t>
       </w:r>
       <w:r>
-        <w:t xml:space="preserve"> In Start(), set the value of this variable to be the gameplay state.</w:t>
+        <w:t xml:space="preserve"> In </w:t>
+      </w:r>
+      <w:proofErr w:type="gramStart"/>
+      <w:r>
+        <w:t>Start(</w:t>
+      </w:r>
+      <w:proofErr w:type="gramEnd"/>
+      <w:r>
+        <w:t>), set the value of this variable to be the gameplay state.</w:t>
       </w:r>
       <w:r>
         <w:t xml:space="preserve"> </w:t>
       </w:r>
       <w:r>
-        <w:t xml:space="preserve">Then, in Update(), create </w:t>
+        <w:t xml:space="preserve">Then, in </w:t>
+      </w:r>
+      <w:proofErr w:type="gramStart"/>
+      <w:r>
+        <w:t>Update(</w:t>
+      </w:r>
+      <w:proofErr w:type="gramEnd"/>
+      <w:r>
+        <w:t xml:space="preserve">), create </w:t>
       </w:r>
       <w:r>
         <w:t xml:space="preserve">if statements to check the value of our Game State Variable, with a nested if statement inside </w:t>
@@ -1237,7 +1306,23 @@
         <w:t>each</w:t>
       </w:r>
       <w:r>
-        <w:t xml:space="preserve"> calling Input.GetKeyDown(KeyCode.Return)</w:t>
+        <w:t xml:space="preserve"> calling </w:t>
+      </w:r>
+      <w:proofErr w:type="spellStart"/>
+      <w:r>
+        <w:t>Input.GetKeyDown</w:t>
+      </w:r>
+      <w:proofErr w:type="spellEnd"/>
+      <w:r>
+        <w:t>(</w:t>
+      </w:r>
+      <w:proofErr w:type="spellStart"/>
+      <w:r>
+        <w:t>KeyCode.Return</w:t>
+      </w:r>
+      <w:proofErr w:type="spellEnd"/>
+      <w:r>
+        <w:t>)</w:t>
       </w:r>
       <w:r>
         <w:t>.</w:t>
@@ -1440,14 +1525,27 @@
       <w:r>
         <w:t xml:space="preserve">As we are passing through functions, we need to keep track of if the game has changed state this frame or not. Create a </w:t>
       </w:r>
+      <w:proofErr w:type="spellStart"/>
       <w:r>
         <w:t>b</w:t>
       </w:r>
       <w:r>
-        <w:t>oolean in the Ga</w:t>
-      </w:r>
-      <w:r>
-        <w:t xml:space="preserve">meState class </w:t>
+        <w:t>oolean</w:t>
+      </w:r>
+      <w:proofErr w:type="spellEnd"/>
+      <w:r>
+        <w:t xml:space="preserve"> in the </w:t>
+      </w:r>
+      <w:proofErr w:type="spellStart"/>
+      <w:r>
+        <w:t>Ga</w:t>
+      </w:r>
+      <w:r>
+        <w:t>meState</w:t>
+      </w:r>
+      <w:proofErr w:type="spellEnd"/>
+      <w:r>
+        <w:t xml:space="preserve"> class </w:t>
       </w:r>
       <w:r>
         <w:t>to hold if the game has changed state this frame</w:t>
@@ -1484,7 +1582,15 @@
         <w:t xml:space="preserve">, </w:t>
       </w:r>
       <w:r>
-        <w:t xml:space="preserve">add the LateUpdate function to our Game Manager class, and include </w:t>
+        <w:t xml:space="preserve">add the </w:t>
+      </w:r>
+      <w:proofErr w:type="spellStart"/>
+      <w:r>
+        <w:t>LateUpdate</w:t>
+      </w:r>
+      <w:proofErr w:type="spellEnd"/>
+      <w:r>
+        <w:t xml:space="preserve"> function to our Game Manager class, and include </w:t>
       </w:r>
       <w:r>
         <w:t xml:space="preserve">inside it </w:t>
@@ -1496,8 +1602,13 @@
         <w:t xml:space="preserve">n if statement on the value of </w:t>
       </w:r>
       <w:r>
-        <w:t>the game state boolean</w:t>
-      </w:r>
+        <w:t xml:space="preserve">the game state </w:t>
+      </w:r>
+      <w:proofErr w:type="spellStart"/>
+      <w:r>
+        <w:t>boolean</w:t>
+      </w:r>
+      <w:proofErr w:type="spellEnd"/>
       <w:r>
         <w:t>, checking if we have changed state this frame</w:t>
       </w:r>
@@ -1511,7 +1622,15 @@
         <w:t xml:space="preserve">Inside this, </w:t>
       </w:r>
       <w:r>
-        <w:t xml:space="preserve">if it is the pause state, set Time.timeScale to </w:t>
+        <w:t xml:space="preserve">if it is the pause state, set </w:t>
+      </w:r>
+      <w:proofErr w:type="spellStart"/>
+      <w:r>
+        <w:t>Time.timeScale</w:t>
+      </w:r>
+      <w:proofErr w:type="spellEnd"/>
+      <w:r>
+        <w:t xml:space="preserve"> to </w:t>
       </w:r>
       <w:r>
         <w:t>0</w:t>
@@ -1520,7 +1639,15 @@
         <w:t xml:space="preserve">.0f. If it is the gameplay state, </w:t>
       </w:r>
       <w:r>
-        <w:t>set Time.timeScale back to the default value of 1.0f. Finally,</w:t>
+        <w:t xml:space="preserve">set </w:t>
+      </w:r>
+      <w:proofErr w:type="spellStart"/>
+      <w:r>
+        <w:t>Time.timeScale</w:t>
+      </w:r>
+      <w:proofErr w:type="spellEnd"/>
+      <w:r>
+        <w:t xml:space="preserve"> back to the default value of 1.0f. Finally,</w:t>
       </w:r>
       <w:r>
         <w:t xml:space="preserve"> we can set the Boolean determining if we’ve </w:t>
@@ -1758,9 +1885,11 @@
       <w:r>
         <w:t xml:space="preserve"> statements work </w:t>
       </w:r>
+      <w:proofErr w:type="gramStart"/>
       <w:r>
         <w:t>okay, but</w:t>
       </w:r>
+      <w:proofErr w:type="gramEnd"/>
       <w:r>
         <w:t xml:space="preserve"> get complicated when checking one variable for multiple values. </w:t>
       </w:r>
@@ -2003,9 +2132,11 @@
       <w:r>
         <w:t xml:space="preserve">Let’s start by making a new </w:t>
       </w:r>
+      <w:proofErr w:type="spellStart"/>
       <w:r>
         <w:t>MonoBehaviour</w:t>
       </w:r>
+      <w:proofErr w:type="spellEnd"/>
       <w:r>
         <w:t xml:space="preserve"> script for our inventor</w:t>
       </w:r>
@@ -2019,7 +2150,15 @@
         <w:t>ing</w:t>
       </w:r>
       <w:r>
-        <w:t xml:space="preserve"> it as a component to the PlayerArmature object </w:t>
+        <w:t xml:space="preserve"> it as a component to the </w:t>
+      </w:r>
+      <w:proofErr w:type="spellStart"/>
+      <w:r>
+        <w:t>PlayerArmature</w:t>
+      </w:r>
+      <w:proofErr w:type="spellEnd"/>
+      <w:r>
+        <w:t xml:space="preserve"> object </w:t>
       </w:r>
       <w:r>
         <w:t>in the scene</w:t>
@@ -2095,7 +2234,17 @@
         <w:t>To create a list, you will need to include</w:t>
       </w:r>
       <w:r>
-        <w:t xml:space="preserve"> the System.Collections.Generic library at the top of your script, then use the following syntax in </w:t>
+        <w:t xml:space="preserve"> the </w:t>
+      </w:r>
+      <w:proofErr w:type="spellStart"/>
+      <w:proofErr w:type="gramStart"/>
+      <w:r>
+        <w:t>System.Collections.Generic</w:t>
+      </w:r>
+      <w:proofErr w:type="spellEnd"/>
+      <w:proofErr w:type="gramEnd"/>
+      <w:r>
+        <w:t xml:space="preserve"> library at the top of your script, then use the following syntax in </w:t>
       </w:r>
       <w:r>
         <w:t>the Inventory class.</w:t>
@@ -2281,8 +2430,13 @@
         <w:t xml:space="preserve"> before we implement our items fully.</w:t>
       </w:r>
       <w:r>
-        <w:t xml:space="preserve"> Using the Input.GetKeyDown</w:t>
-      </w:r>
+        <w:t xml:space="preserve"> Using the </w:t>
+      </w:r>
+      <w:proofErr w:type="spellStart"/>
+      <w:r>
+        <w:t>Input.GetKeyDown</w:t>
+      </w:r>
+      <w:proofErr w:type="spellEnd"/>
       <w:r>
         <w:t>()</w:t>
       </w:r>
@@ -2296,14 +2450,22 @@
         <w:t>adds and removes some item names from our inventory using the functions you have just written</w:t>
       </w:r>
       <w:r>
-        <w:t xml:space="preserve"> – </w:t>
+        <w:t xml:space="preserve"> </w:t>
       </w:r>
       <w:r>
         <w:lastRenderedPageBreak/>
-        <w:t>below is some example code</w:t>
-      </w:r>
-      <w:r>
-        <w:t>. You can test this functionality by looking at the Inventory component attached to the PlayerArmature in the inspector.</w:t>
+        <w:t>– below is some example code</w:t>
+      </w:r>
+      <w:r>
+        <w:t xml:space="preserve">. You can test this functionality by looking at the Inventory component attached to the </w:t>
+      </w:r>
+      <w:proofErr w:type="spellStart"/>
+      <w:r>
+        <w:t>PlayerArmature</w:t>
+      </w:r>
+      <w:proofErr w:type="spellEnd"/>
+      <w:r>
+        <w:t xml:space="preserve"> in the inspector.</w:t>
       </w:r>
     </w:p>
     <w:p>
@@ -2430,8 +2592,13 @@
       <w:r>
         <w:t xml:space="preserve">, or by calling the </w:t>
       </w:r>
-      <w:r>
-        <w:t>FindAnyObjectByType&lt;T&gt; function</w:t>
+      <w:proofErr w:type="spellStart"/>
+      <w:r>
+        <w:t>FindAnyObjectByType</w:t>
+      </w:r>
+      <w:proofErr w:type="spellEnd"/>
+      <w:r>
+        <w:t>&lt;T&gt; function</w:t>
       </w:r>
       <w:r>
         <w:t xml:space="preserve"> replacing the generic identifier T with the class you </w:t>
@@ -2528,7 +2695,15 @@
         <w:t xml:space="preserve">see if your code </w:t>
       </w:r>
       <w:r>
-        <w:t>runs in the functions you’ve specified</w:t>
+        <w:t xml:space="preserve">runs in the </w:t>
+      </w:r>
+      <w:proofErr w:type="gramStart"/>
+      <w:r>
+        <w:t>functions</w:t>
+      </w:r>
+      <w:proofErr w:type="gramEnd"/>
+      <w:r>
+        <w:t xml:space="preserve"> you’ve specified</w:t>
       </w:r>
       <w:r>
         <w:t xml:space="preserve"> only.</w:t>
@@ -2675,14 +2850,38 @@
         <w:t>f you still want to modify these values in the inspector,</w:t>
       </w:r>
       <w:r>
-        <w:t xml:space="preserve"> look into the </w:t>
+        <w:t xml:space="preserve"> </w:t>
+      </w:r>
+      <w:proofErr w:type="gramStart"/>
+      <w:r>
+        <w:t>look into</w:t>
+      </w:r>
+      <w:proofErr w:type="gramEnd"/>
+      <w:r>
+        <w:t xml:space="preserve"> the </w:t>
       </w:r>
       <w:r>
         <w:rPr>
           <w:b/>
           <w:bCs/>
         </w:rPr>
-        <w:t xml:space="preserve">[SerializeField] </w:t>
+        <w:t>[</w:t>
+      </w:r>
+      <w:proofErr w:type="spellStart"/>
+      <w:r>
+        <w:rPr>
+          <w:b/>
+          <w:bCs/>
+        </w:rPr>
+        <w:t>SerializeField</w:t>
+      </w:r>
+      <w:proofErr w:type="spellEnd"/>
+      <w:r>
+        <w:rPr>
+          <w:b/>
+          <w:bCs/>
+        </w:rPr>
+        <w:t xml:space="preserve">] </w:t>
       </w:r>
       <w:r>
         <w:t>attribute</w:t>
@@ -2818,14 +3017,17 @@
         <w:t>, either on entry or on command</w:t>
       </w:r>
       <w:r>
-        <w:t xml:space="preserve">. You will have learned about </w:t>
+        <w:t xml:space="preserve">. You will have learned </w:t>
+      </w:r>
+      <w:r>
+        <w:lastRenderedPageBreak/>
+        <w:t xml:space="preserve">about </w:t>
       </w:r>
       <w:r>
         <w:rPr>
           <w:b/>
           <w:bCs/>
         </w:rPr>
-        <w:lastRenderedPageBreak/>
         <w:t>sorting algorithms</w:t>
       </w:r>
       <w:r>
@@ -3056,9 +3258,11 @@
       <w:r>
         <w:t xml:space="preserve">Create a new </w:t>
       </w:r>
+      <w:proofErr w:type="spellStart"/>
       <w:r>
         <w:t>MonoBehaviour</w:t>
       </w:r>
+      <w:proofErr w:type="spellEnd"/>
       <w:r>
         <w:t xml:space="preserve"> script for our </w:t>
       </w:r>
@@ -3182,7 +3386,23 @@
         </w:rPr>
       </w:pPr>
       <w:r>
-        <w:t xml:space="preserve">Note: When you create a script in Unity, it will automatically inherit it from the MonoBehaviour base class, along with the Start and Update functions. These functions will be called by Unity’s engine during the update cycle as we discussed in the lecture content. It also treats the script as a component for Unity’s GameObject model. If your script is pure code, </w:t>
+        <w:t xml:space="preserve">Note: When you create a script in Unity, it will automatically inherit it from the </w:t>
+      </w:r>
+      <w:proofErr w:type="spellStart"/>
+      <w:r>
+        <w:t>MonoBehaviour</w:t>
+      </w:r>
+      <w:proofErr w:type="spellEnd"/>
+      <w:r>
+        <w:t xml:space="preserve"> base class, along with the Start and Update functions. These functions will be called by Unity’s engine during the update cycle as we discussed in the lecture content. It also treats the script as a component for Unity’s </w:t>
+      </w:r>
+      <w:proofErr w:type="spellStart"/>
+      <w:r>
+        <w:t>GameObject</w:t>
+      </w:r>
+      <w:proofErr w:type="spellEnd"/>
+      <w:r>
+        <w:t xml:space="preserve"> model. If your script is pure code, </w:t>
       </w:r>
       <w:r>
         <w:t>it</w:t>
@@ -3194,7 +3414,23 @@
         <w:t>es</w:t>
       </w:r>
       <w:r>
-        <w:t xml:space="preserve"> not need to inherit from MonoBehaviour and may cause problems if it does. Therefore, if your script is not something that should be an object component, you should remove the MonoBehaviour inheritance.</w:t>
+        <w:t xml:space="preserve"> not need to inherit from </w:t>
+      </w:r>
+      <w:proofErr w:type="spellStart"/>
+      <w:r>
+        <w:t>MonoBehaviour</w:t>
+      </w:r>
+      <w:proofErr w:type="spellEnd"/>
+      <w:r>
+        <w:t xml:space="preserve"> and may cause problems if it does. Therefore, if your script is not something that should be an object component, you should remove the </w:t>
+      </w:r>
+      <w:proofErr w:type="spellStart"/>
+      <w:r>
+        <w:t>MonoBehaviour</w:t>
+      </w:r>
+      <w:proofErr w:type="spellEnd"/>
+      <w:r>
+        <w:t xml:space="preserve"> inheritance.</w:t>
       </w:r>
     </w:p>
     <w:p>
@@ -3239,7 +3475,15 @@
         <w:t>implement item interaction through the Inventory class</w:t>
       </w:r>
       <w:r>
-        <w:t>. Do this by adding the OnControllerColliderHit function</w:t>
+        <w:t xml:space="preserve">. Do this by adding the </w:t>
+      </w:r>
+      <w:proofErr w:type="spellStart"/>
+      <w:r>
+        <w:t>OnControllerColliderHit</w:t>
+      </w:r>
+      <w:proofErr w:type="spellEnd"/>
+      <w:r>
+        <w:t xml:space="preserve"> function</w:t>
       </w:r>
       <w:r>
         <w:t xml:space="preserve"> to the script.</w:t>
@@ -3276,7 +3520,15 @@
         <w:t>evaluating if the object collided with has a</w:t>
       </w:r>
       <w:r>
-        <w:t>n item component by calling the GetComponent function</w:t>
+        <w:t xml:space="preserve">n item component by calling the </w:t>
+      </w:r>
+      <w:proofErr w:type="spellStart"/>
+      <w:r>
+        <w:t>GetComponent</w:t>
+      </w:r>
+      <w:proofErr w:type="spellEnd"/>
+      <w:r>
+        <w:t xml:space="preserve"> function</w:t>
       </w:r>
       <w:r>
         <w:t xml:space="preserve"> for the item component type.</w:t>
@@ -3365,7 +3617,15 @@
         <w:t xml:space="preserve"> To do this, call the Destroy function </w:t>
       </w:r>
       <w:r>
-        <w:t xml:space="preserve">below the code we have just written, passing through the gameObject property of the </w:t>
+        <w:t xml:space="preserve">below the code we have just written, passing through the </w:t>
+      </w:r>
+      <w:proofErr w:type="spellStart"/>
+      <w:r>
+        <w:t>gameObject</w:t>
+      </w:r>
+      <w:proofErr w:type="spellEnd"/>
+      <w:r>
+        <w:t xml:space="preserve"> property of the </w:t>
       </w:r>
       <w:r>
         <w:t xml:space="preserve">collider our character controller has hit. This will </w:t>
@@ -3553,7 +3813,6 @@
         <w:pStyle w:val="Heading2"/>
       </w:pPr>
       <w:r>
-        <w:lastRenderedPageBreak/>
         <w:t xml:space="preserve"> Extension Tasks</w:t>
       </w:r>
     </w:p>
@@ -3564,6 +3823,7 @@
         </w:rPr>
       </w:pPr>
       <w:r>
+        <w:lastRenderedPageBreak/>
         <w:t>Once you have successfully completed the work outlined above, consider the following ways in which you may want to extend your project to further its quality, your understanding</w:t>
       </w:r>
       <w:r>
@@ -3748,10 +4008,18 @@
         <w:t xml:space="preserve">to </w:t>
       </w:r>
       <w:r>
-        <w:t>it, and a</w:t>
-      </w:r>
-      <w:r>
-        <w:t xml:space="preserve">t the moment, </w:t>
+        <w:t xml:space="preserve">it, and </w:t>
+      </w:r>
+      <w:proofErr w:type="gramStart"/>
+      <w:r>
+        <w:t>a</w:t>
+      </w:r>
+      <w:r>
+        <w:t>t the moment</w:t>
+      </w:r>
+      <w:proofErr w:type="gramEnd"/>
+      <w:r>
+        <w:t xml:space="preserve">, </w:t>
       </w:r>
       <w:r>
         <w:t xml:space="preserve">interacting with </w:t>
@@ -9626,6 +9894,15 @@
 </file>
 
 <file path=customXml/item1.xml><?xml version="1.0" encoding="utf-8"?>
+<?mso-contentType ?>
+<FormTemplates xmlns="http://schemas.microsoft.com/sharepoint/v3/contenttype/forms">
+  <Display>DocumentLibraryForm</Display>
+  <Edit>DocumentLibraryForm</Edit>
+  <New>DocumentLibraryForm</New>
+</FormTemplates>
+</file>
+
+<file path=customXml/item2.xml><?xml version="1.0" encoding="utf-8"?>
 <ct:contentTypeSchema xmlns:ct="http://schemas.microsoft.com/office/2006/metadata/contentType" xmlns:ma="http://schemas.microsoft.com/office/2006/metadata/properties/metaAttributes" ct:_="" ma:_="" ma:contentTypeName="Document" ma:contentTypeID="0x0101001BECA5111B9F15418DB6E90C815CB950" ma:contentTypeVersion="19" ma:contentTypeDescription="Create a new document." ma:contentTypeScope="" ma:versionID="cb96dcb735f67fe489b9d6a491775850">
   <xsd:schema xmlns:xsd="http://www.w3.org/2001/XMLSchema" xmlns:xs="http://www.w3.org/2001/XMLSchema" xmlns:p="http://schemas.microsoft.com/office/2006/metadata/properties" xmlns:ns2="9d0996c0-92aa-48de-be34-d82d85a58d42" xmlns:ns3="3ad65f39-9fa6-40f7-afab-38d2a8f659f9" targetNamespace="http://schemas.microsoft.com/office/2006/metadata/properties" ma:root="true" ma:fieldsID="ce5eca6df8a9b9f3e548e771f2e2bae3" ns2:_="" ns3:_="">
     <xsd:import namespace="9d0996c0-92aa-48de-be34-d82d85a58d42"/>
@@ -9886,15 +10163,6 @@
 </ct:contentTypeSchema>
 </file>
 
-<file path=customXml/item2.xml><?xml version="1.0" encoding="utf-8"?>
-<?mso-contentType ?>
-<FormTemplates xmlns="http://schemas.microsoft.com/sharepoint/v3/contenttype/forms">
-  <Display>DocumentLibraryForm</Display>
-  <Edit>DocumentLibraryForm</Edit>
-  <New>DocumentLibraryForm</New>
-</FormTemplates>
-</file>
-
 <file path=customXml/item3.xml><?xml version="1.0" encoding="utf-8"?>
 <p:properties xmlns:p="http://schemas.microsoft.com/office/2006/metadata/properties" xmlns:xsi="http://www.w3.org/2001/XMLSchema-instance" xmlns:pc="http://schemas.microsoft.com/office/infopath/2007/PartnerControls">
   <documentManagement>
@@ -9907,6 +10175,14 @@
 </file>
 
 <file path=customXml/itemProps1.xml><?xml version="1.0" encoding="utf-8"?>
+<ds:datastoreItem xmlns:ds="http://schemas.openxmlformats.org/officeDocument/2006/customXml" ds:itemID="{9CCE7874-640B-43E8-943D-5071FCF6A23C}">
+  <ds:schemaRefs>
+    <ds:schemaRef ds:uri="http://schemas.microsoft.com/sharepoint/v3/contenttype/forms"/>
+  </ds:schemaRefs>
+</ds:datastoreItem>
+</file>
+
+<file path=customXml/itemProps2.xml><?xml version="1.0" encoding="utf-8"?>
 <ds:datastoreItem xmlns:ds="http://schemas.openxmlformats.org/officeDocument/2006/customXml" ds:itemID="{B6BAFB03-C161-41D2-8692-D31C049EAC1C}">
   <ds:schemaRefs>
     <ds:schemaRef ds:uri="http://schemas.microsoft.com/office/2006/metadata/contentType"/>
@@ -9925,14 +10201,6 @@
 </ds:datastoreItem>
 </file>
 
-<file path=customXml/itemProps2.xml><?xml version="1.0" encoding="utf-8"?>
-<ds:datastoreItem xmlns:ds="http://schemas.openxmlformats.org/officeDocument/2006/customXml" ds:itemID="{9CCE7874-640B-43E8-943D-5071FCF6A23C}">
-  <ds:schemaRefs>
-    <ds:schemaRef ds:uri="http://schemas.microsoft.com/sharepoint/v3/contenttype/forms"/>
-  </ds:schemaRefs>
-</ds:datastoreItem>
-</file>
-
 <file path=customXml/itemProps3.xml><?xml version="1.0" encoding="utf-8"?>
 <ds:datastoreItem xmlns:ds="http://schemas.openxmlformats.org/officeDocument/2006/customXml" ds:itemID="{732812F3-F22F-40A6-B47F-2A4BCB919407}">
   <ds:schemaRefs>

</xml_diff>